<commit_message>
v1.12.1: Genericise plugin documentation: remove GCIS-specific references from user-facing docs; bid plan and seed schedule codes are now generic. ExtendedRights/ReportBuilder/NARSSA/ShareLink/VersionControl docs reworded for the wider GLAM market.
</commit_message>
<xml_diff>
--- a/docs/AtoM_Heratio_NARSSA_Feature_Overview.docx
+++ b/docs/AtoM_Heratio_NARSSA_Feature_Overview.docx
@@ -220,23 +220,7 @@
         <w:pStyle w:val="BodyText"/>
       </w:pPr>
       <w:r>
-        <w:t xml:space="preserve">This closes GCIS RFB-001 clause</w:t>
-      </w:r>
-      <w:r>
-        <w:t xml:space="preserve"> </w:t>
-      </w:r>
-      <w:r>
-        <w:rPr>
-          <w:bCs/>
-          <w:b/>
-        </w:rPr>
-        <w:t xml:space="preserve">4.6</w:t>
-      </w:r>
-      <w:r>
-        <w:t xml:space="preserve"> </w:t>
-      </w:r>
-      <w:r>
-        <w:t xml:space="preserve">(records management strategy + NARSSA compliance) for the transfer step that is otherwise implicit in clause 4.1.1.13.b.</w:t>
+        <w:t xml:space="preserve">This addresses the archival-transfer step required by national records-management frameworks: NARSSA (South Africa), NARA Federal Records Act (US), Public Records Act (UK), and equivalents. The plugin produces the standards-compliant package; transmission is operator-driven.</w:t>
       </w:r>
     </w:p>
     <w:p>
@@ -944,7 +928,7 @@
               <w:jc w:val="left"/>
             </w:pPr>
             <w:r>
-              <w:t xml:space="preserve">GCIS RFB-001 clause 4.6 (records management strategy)</w:t>
+              <w:t xml:space="preserve">Records management strategy (any national framework)</w:t>
             </w:r>
           </w:p>
         </w:tc>
@@ -970,7 +954,7 @@
               <w:jc w:val="left"/>
             </w:pPr>
             <w:r>
-              <w:t xml:space="preserve">GCIS RFB-001 clause 4.1.1.13.b (controlled disposal with audit logs)</w:t>
+              <w:t xml:space="preserve">Controlled disposal with audit logs</w:t>
             </w:r>
           </w:p>
         </w:tc>

</xml_diff>